<commit_message>
Correct user guide, SECURITY.md and README against current behaviour
- Commentary payload includes category, subcategory and merchant names
  with amounts (guide §8.4/§10.2, SECURITY.md)
- Inline editor cancels on blur/Escape/tab; saves on pick or Enter
- Fix section cross-references (§1, §4.2 -> Section 10.2)
- Remove non-existent "Verified" status; README describes the totals check
- Payment flag values, merchant-only "from description" tier, per-field
  bulk-accept buttons, multi-row editing, period controls

Co-Authored-By: Claude Opus 5.5 <noreply@anthropic.com>
</commit_message>
<xml_diff>
--- a/docs/USER_GUIDE.docx
+++ b/docs/USER_GUIDE.docx
@@ -212,7 +212,7 @@
           <w:sz w:val="22"/>
           <w:szCs w:val="22"/>
         </w:rPr>
-        <w:t xml:space="preserve">Section 8</w:t>
+        <w:t>Section 10.2</w:t>
       </w:r>
       <w:r>
         <w:rPr>
@@ -836,24 +836,6 @@
           <w:sz w:val="22"/>
           <w:szCs w:val="22"/>
         </w:rPr>
-        <w:t xml:space="preserve">Verification workflow (Verified / Mismatch / Unverified)</w:t>
-      </w:r>
-    </w:p>
-    <w:p>
-      <w:pPr>
-        <w:pStyle w:val="ListParagraph"/>
-        <w:numPr>
-          <w:ilvl w:val="0"/>
-          <w:numId w:val="2"/>
-        </w:numPr>
-        <w:spacing w:after="60"/>
-      </w:pPr>
-      <w:r>
-        <w:rPr>
-          <w:rFonts w:ascii="Arial" w:cs="Arial" w:eastAsia="Arial" w:hAnsi="Arial"/>
-          <w:sz w:val="22"/>
-          <w:szCs w:val="22"/>
-        </w:rPr>
         <w:t xml:space="preserve">Analytics dashboard with drill-down by category, subcategory, or merchant</w:t>
       </w:r>
     </w:p>
@@ -1998,7 +1980,7 @@
           <w:sz w:val="22"/>
           <w:szCs w:val="22"/>
         </w:rPr>
-        <w:t xml:space="preserve"> toggle is available on this screen. When enabled, the app sends transaction descriptions, dates, and amounts to Google Gemini for parsing. Card and account numbers are stripped before sending. See Section 8 for details.</w:t>
+        <w:t xml:space="preserve"> toggle is available on this screen. When enabled, the app sends transaction descriptions, dates, and amounts to Google Gemini for parsing. Card and account numbers are stripped before sending. See Section 10.2 for details.</w:t>
       </w:r>
     </w:p>
     <w:p>
@@ -2781,7 +2763,7 @@
           <w:sz w:val="22"/>
           <w:szCs w:val="22"/>
         </w:rPr>
-        <w:t xml:space="preserve"> — a best-guess extracted from the transaction description itself</w:t>
+        <w:t xml:space="preserve"> — a best-guess extracted from the transaction description itself. The 'from description' fallback applies to the Merchant field only; Category suggestions use exact and fuzzy matching.</w:t>
       </w:r>
     </w:p>
     <w:p>
@@ -2863,7 +2845,7 @@
           <w:sz w:val="22"/>
           <w:szCs w:val="22"/>
         </w:rPr>
-        <w:t xml:space="preserve">A "save to selected" option when multiple rows are selected — applies the same value to all selected transactions</w:t>
+        <w:t>When multiple rows are selected, editing any selected row's label applies to all of them</w:t>
       </w:r>
     </w:p>
     <w:p>
@@ -2889,7 +2871,7 @@
           <w:sz w:val="22"/>
           <w:szCs w:val="22"/>
         </w:rPr>
-        <w:t xml:space="preserve">Press </w:t>
+        <w:t xml:space="preserve">Pick a suggestion from the dropdown to save it immediately, or type a value and press </w:t>
       </w:r>
       <w:r>
         <w:rPr>
@@ -2907,7 +2889,7 @@
           <w:sz w:val="22"/>
           <w:szCs w:val="22"/>
         </w:rPr>
-        <w:t xml:space="preserve"> or click outside to save. Press </w:t>
+        <w:t xml:space="preserve">. Press </w:t>
       </w:r>
       <w:r>
         <w:rPr>
@@ -2925,7 +2907,7 @@
           <w:sz w:val="22"/>
           <w:szCs w:val="22"/>
         </w:rPr>
-        <w:t xml:space="preserve"> to cancel.</w:t>
+        <w:t>, click elsewhere, or tab away to cancel — nothing is saved.</w:t>
       </w:r>
     </w:p>
     <w:p>
@@ -3007,7 +2989,7 @@
           <w:sz w:val="22"/>
           <w:szCs w:val="22"/>
         </w:rPr>
-        <w:t xml:space="preserve">"Accept suggestions" button — writes each selected transaction's own suggestion for the active field</w:t>
+        <w:t>"Accept category suggestions (n)", "Accept subcategory suggestions (n)" and "Accept merchant suggestions (n)" — one button per field, following the active Category / Sub Category / Merchant toggle; writes each selected transaction's own suggestion for that field</w:t>
       </w:r>
     </w:p>
     <w:p>
@@ -3115,7 +3097,7 @@
           <w:sz w:val="22"/>
           <w:szCs w:val="22"/>
         </w:rPr>
-        <w:t xml:space="preserve"> toggle. Marking a transaction as a payment sets its category, subcategory, and merchant to their payment values, excluding it from spending totals. Unmarking reverts to NULL.</w:t>
+        <w:t xml:space="preserve"> toggle. Marking a transaction as a payment sets category and subcategory to 'Credit Card Payment' and merchant to the card's bank name, excluding it from spending totals. Unmarking reverts to NULL.</w:t>
       </w:r>
     </w:p>
     <w:p>
@@ -3355,7 +3337,7 @@
           <w:sz w:val="22"/>
           <w:szCs w:val="22"/>
         </w:rPr>
-        <w:t xml:space="preserve">At the top of the dashboard, select the time period to analyse. The period is resolved server-side and shown as a concrete date range (e.g. "2026-08-01 → 2026-08-31"). The total spend for the period appears next to it.</w:t>
+        <w:t>At the top of the dashboard, select the time period to analyse. Choose Week, Month, Quarter, Year or Custom granularity; Week/Month/Quarter/Year also offer a 'Last N' mode. The period is resolved server-side and shown as a concrete date range (e.g. "2026-08-01 → 2026-08-31"). The total spend for the period appears next to it.</w:t>
       </w:r>
     </w:p>
     <w:p>
@@ -3649,7 +3631,7 @@
           <w:sz w:val="22"/>
           <w:szCs w:val="22"/>
         </w:rPr>
-        <w:t xml:space="preserve">This feature requires GEMINI_API_KEY in .env. The commentary request sends category-level spending amounts (no transaction descriptions) to the Gemini API. See Section 10 for privacy details.</w:t>
+        <w:t>This feature requires GEMINI_API_KEY in .env. The commentary request to the Gemini API sends category, subcategory and merchant names with their amounts for the selected period. No transaction descriptions, dates or transaction counts are sent. See Section 10 for privacy details.</w:t>
       </w:r>
     </w:p>
     <w:p>
@@ -4046,7 +4028,7 @@
           <w:sz w:val="22"/>
           <w:szCs w:val="22"/>
         </w:rPr>
-        <w:t xml:space="preserve"> — sends category-level spending amounts (e.g. "Food: ₹12,000"). No transaction descriptions, dates, or merchant names are sent.</w:t>
+        <w:t xml:space="preserve"> — sends category, subcategory and merchant names with their amounts for the selected period. No transaction descriptions, dates or transaction counts are sent.</w:t>
       </w:r>
     </w:p>
     <w:p>

</xml_diff>